<commit_message>
Organização de pastas css e documentacao
</commit_message>
<xml_diff>
--- a/documentacao/Escopo do projeto.docx
+++ b/documentacao/Escopo do projeto.docx
@@ -1881,7 +1881,29 @@
                 <w:szCs w:val="24"/>
                 <w:lang w:eastAsia="pt-BR"/>
               </w:rPr>
-              <w:t>PERMITIR QUE O USUÁRIO CRIE UMA CONTA E FAÇALOGIN QUANDO QUISE</w:t>
+              <w:t>PERMITIR QUE O USUÁRIO CRIE UMA CONTA E FAÇA</w:t>
+            </w:r>
+            <w:r>
+              <w:rPr>
+                <w:rFonts w:ascii="Times New Roman" w:eastAsia="Times New Roman" w:hAnsi="Times New Roman" w:cs="Times New Roman"/>
+                <w:color w:val="000000"/>
+                <w:sz w:val="24"/>
+                <w:szCs w:val="24"/>
+                <w:lang w:eastAsia="pt-BR"/>
+              </w:rPr>
+              <w:t xml:space="preserve"> </w:t>
+            </w:r>
+            <w:bookmarkStart w:id="0" w:name="_GoBack"/>
+            <w:bookmarkEnd w:id="0"/>
+            <w:r>
+              <w:rPr>
+                <w:rFonts w:ascii="Times New Roman" w:eastAsia="Times New Roman" w:hAnsi="Times New Roman" w:cs="Times New Roman"/>
+                <w:color w:val="000000"/>
+                <w:sz w:val="24"/>
+                <w:szCs w:val="24"/>
+                <w:lang w:eastAsia="pt-BR"/>
+              </w:rPr>
+              <w:t>LOGIN QUANDO QUISE</w:t>
             </w:r>
             <w:r>
               <w:rPr>
@@ -3261,17 +3283,6 @@
                 <w:lang w:eastAsia="pt-BR"/>
               </w:rPr>
               <w:br/>
-            </w:r>
-            <w:bookmarkStart w:id="0" w:name="_GoBack"/>
-            <w:bookmarkEnd w:id="0"/>
-            <w:r>
-              <w:rPr>
-                <w:rFonts w:ascii="Times New Roman" w:eastAsia="Times New Roman" w:hAnsi="Times New Roman" w:cs="Times New Roman"/>
-                <w:color w:val="000000"/>
-                <w:sz w:val="24"/>
-                <w:szCs w:val="24"/>
-                <w:lang w:eastAsia="pt-BR"/>
-              </w:rPr>
               <w:t>DO MESMO.</w:t>
             </w:r>
           </w:p>

</xml_diff>